<commit_message>
feat(savings): apply due scheduled contributions
Recognize the approved schedule at its due date, with dated
exceptions, SYSTEM provenance and delta-only corrections.

Migration 004 preserves prior history and protects certified
cutoffs, held capital and completed yield periods. Catch up
September 30 and keep future dates outside the current balance.
</commit_message>
<xml_diff>
--- a/docs/manuales/Manual_de_uso_SICOF.docx
+++ b/docs/manuales/Manual_de_uso_SICOF.docx
@@ -25,7 +25,7 @@
     </w:p>
     <w:p>
       <w:r>
-        <w:t>Edición 1.0 · Aplicación v312 · Motor SICOF_2026_10_03_V2 · 3 de octubre de 2026</w:t>
+        <w:t>Edición 1.1 · Aplicación v313 · Motor SICOF_2026_10_03_V2 · 3 de octubre de 2026</w:t>
       </w:r>
     </w:p>
     <w:p>
@@ -348,7 +348,7 @@
     <w:p/>
     <w:p>
       <w:r>
-        <w:t>El orden de las pestañas puede haber sido personalizado por un administrador. Editar textos permite modificar títulos y explicaciones dentro del módulo; las etiquetas de las ocho pestañas permanecen fijas en v312.</w:t>
+        <w:t>El orden de las pestañas puede haber sido personalizado por un administrador. Editar textos permite modificar títulos y explicaciones dentro del módulo; las etiquetas de las ocho pestañas permanecen fijas en v313.</w:t>
       </w:r>
     </w:p>
     <w:p>
@@ -600,7 +600,7 @@
               <w:rPr>
                 <w:sz w:val="18"/>
               </w:rPr>
-              <w:t>Identidad, inscripción, plan, historia certificada, aportaciones confirmadas, rendimientos acreditados, retiros, retenciones y saldos canónicos.</w:t>
+              <w:t>Identidad, plan, historia certificada, aportaciones aplicadas al vencimiento, rendimientos acreditados, retiros y saldos.</w:t>
             </w:r>
           </w:p>
         </w:tc>
@@ -613,7 +613,7 @@
               <w:rPr>
                 <w:sz w:val="18"/>
               </w:rPr>
-              <w:t>Una mensualidad programada todavía no es una aportación pagada.</w:t>
+              <w:t>Las fechas futuras todavía no aumentan el saldo. El abono sigue la instrucción de ahorro, no una consulta bancaria.</w:t>
             </w:r>
           </w:p>
         </w:tc>
@@ -758,7 +758,12 @@
     </w:p>
     <w:p>
       <w:r>
-        <w:t>El historial de préstamos se consulta mediante un lector fijo y autenticado de Apps Script. El navegador recibe el resultado del servidor; no elige otra hoja ni una copia alternativa cuando Google falla. El archivo espejo del SICOF antiguo no es la fuente de esta integración publicada.</w:t>
+        <w:t>Desde el 30/09/2026, Ahorro aplica automáticamente el importe programado cuando llega su fecha, salvo corrección de la encargada. El servidor revisa vencimientos cada cinco minutos, sin exigir otra conciliación. Registra recibo y movimiento una sola vez; SICOF lee ese movimiento. El rendimiento acumulado permanece separado.</w:t>
+      </w:r>
+    </w:p>
+    <w:p>
+      <w:r>
+        <w:t>Los préstamos se consultan mediante un lector fijo y autenticado de Apps Script. Si Google falla, no se sustituye por el archivo espejo del SICOF antiguo.</w:t>
       </w:r>
     </w:p>
     <w:p>
@@ -2719,7 +2724,7 @@
         <w:shd w:fill="FBF5E9"/>
       </w:pPr>
       <w:r>
-        <w:t>La explicación fija de la pantalla menciona «saldo elegible final» para % s/saldo. La fórmula efectiva de v312 usa la base del método seleccionado, como se detalla arriba. Cuando existan pendientes, una tasa calculada sobre los casos verificables sigue siendo provisional.</w:t>
+        <w:t>La explicación fija de la pantalla menciona «saldo elegible final» para % s/saldo. La fórmula efectiva de v313 usa la base del método seleccionado, como se detalla arriba. Cuando existan pendientes, una tasa calculada sobre los casos verificables sigue siendo provisional.</w:t>
       </w:r>
     </w:p>
     <w:p>
@@ -4806,7 +4811,7 @@
     </w:p>
     <w:p>
       <w:r>
-        <w:t>Cuando se conocen aportaciones registradas pero falta demostrar todo el tramo anterior a la certificación o hay recibos pendientes de confirmar, el acumulado confirmado se marca como parcial y se explica en la celda/notas. Sólo suma registros comprobados: es un subtotal respaldado, no un cierre completo del semestre. Si hay conflicto, falta identidad o no existe importe comprobable, aparece POR CONCILIAR en vez de inventar cero.</w:t>
+        <w:t>Si falta demostrar el tramo anterior a la certificación o quedan recibos pendientes por una excepción, el acumulado registrado se marca como parcial y se explica en la celda/notas. Las aportaciones automáticas ya aplicadas sí se suman. Un pendiente requiere revisar su causa, no confirmar manualmente cada quincena. Si hay conflicto, falta identidad o no existe importe comprobable, aparece POR CONCILIAR en vez de inventar cero.</w:t>
       </w:r>
     </w:p>
     <w:p>
@@ -5761,7 +5766,7 @@
     <w:p/>
     <w:p>
       <w:r>
-        <w:t>Abrir SICOF, cambiar el periodo o pulsar Actualizar realiza nuevas consultas. No hay actualización automática programada en segundo plano. La fecha de observación indica cuándo se leyó la fuente, no cuándo se recibió un pago.</w:t>
+        <w:t>Abrir SICOF, cambiar el periodo o pulsar Actualizar consulta de nuevo las fuentes; la pantalla no se refresca sola. Ahorro sí aplica los vencimientos automáticamente en el servidor. La fecha de observación indica cuándo se consultó la información.</w:t>
       </w:r>
     </w:p>
     <w:tbl>
@@ -6936,7 +6941,7 @@
               <w:rPr>
                 <w:sz w:val="18"/>
               </w:rPr>
-              <w:t>savings_contribution_overrides conserva la última revisión; savings_contribution_plans y generate_savings_schedule generan lo previsto. Previsión no equivale a recibo real.</w:t>
+              <w:t>savings_contribution_plans y generate_savings_schedule dan el importe previsto; savings_automatic_private conserva excepciones y ejecuta vencimientos. savings_contribution_overrides identifica recibo automático o corrección humana.</w:t>
             </w:r>
           </w:p>
         </w:tc>
@@ -7112,42 +7117,47 @@
     </w:p>
     <w:p>
       <w:r>
-        <w:t>2. Revisar fondos que alimentan la bolsa y separar capital recuperado, interés puro y gasto administrativo.</w:t>
+        <w:t>2. En Ahorro, abra el calendario de la persona. Antes del vencimiento, Modificar importe programado permite una excepción, incluso cero, sin abonar anticipadamente. Después, Corregir aportación aplicada registra sólo la diferencia y conserva la historia. Un cambio permanente se hace en el plan. Reporte RH muestra instrucciones de descuento; el informe SICOF muestra movimientos aplicados.</w:t>
       </w:r>
     </w:p>
     <w:p>
       <w:r>
-        <w:t>3. Confirmar capital acumulado o aportaciones del semestre y la opción de rendimiento sobre rendimientos anteriores.</w:t>
+        <w:t>3. Revisar fondos que alimentan la bolsa y separar capital recuperado, interés puro y gasto administrativo.</w:t>
       </w:r>
     </w:p>
     <w:p>
       <w:r>
-        <w:t>4. Revisar elegibles, excluidos y pendientes. Resolver datos incompletos antes de presentar una tasa como definitiva.</w:t>
+        <w:t>4. Confirmar capital acumulado o aportaciones del semestre y la opción de rendimiento sobre rendimientos anteriores.</w:t>
       </w:r>
     </w:p>
     <w:p>
       <w:r>
-        <w:t>5. Agregar todos los costos del escenario con origen, estado y fecha.</w:t>
+        <w:t>5. Revisar elegibles, excluidos y pendientes. Resolver datos incompletos antes de presentar una tasa como definitiva.</w:t>
       </w:r>
     </w:p>
     <w:p>
       <w:r>
-        <w:t>6. Verificar el saldo bancario declarado, quién lo declara y la cobertura de retiros.</w:t>
+        <w:t>6. Agregar todos los costos del escenario con origen, estado y fecha.</w:t>
       </w:r>
     </w:p>
     <w:p>
       <w:r>
-        <w:t>7. Comparar escenarios y conservar el elegido. Exportar acta/reparto para revisión de la dirección.</w:t>
+        <w:t>7. Verificar el saldo bancario declarado, quién lo declara y la cobertura de retiros.</w:t>
       </w:r>
     </w:p>
     <w:p>
       <w:r>
-        <w:t>8. Descargar el informe continuo para conocer lo realmente registrado por persona, periodo, retiros y saldo. No confundirlo con el reparto simulado.</w:t>
+        <w:t>8. Comparar escenarios y conservar el elegido. Exportar acta/reparto para revisión de la dirección.</w:t>
       </w:r>
     </w:p>
     <w:p>
       <w:r>
-        <w:t>9. La autorización y acreditación real del rendimiento se atienden en el proceso de Ahorro correspondiente; verificar después el crédito en el informe.</w:t>
+        <w:t>9. Descargar el informe continuo para conocer lo realmente registrado por persona, periodo, retiros y saldo. No confundirlo con el reparto simulado.</w:t>
+      </w:r>
+    </w:p>
+    <w:p>
+      <w:r>
+        <w:t>10. La autorización y acreditación real del rendimiento se atienden en el proceso de Ahorro correspondiente; verificar después el crédito en el informe.</w:t>
       </w:r>
     </w:p>
     <w:p>
@@ -7168,7 +7178,7 @@
     </w:p>
     <w:p>
       <w:r>
-        <w:t>Manual elaborado a partir de la interfaz publicada v312, el motor SICOF_2026_10_03_V2, sus lectores y contratos de datos, más la corrección del informe continuo de esta edición. Fecha de referencia: 3 de octubre de 2026. Los ejemplos son didácticos y no constituyen tasas aprobadas ni movimientos reales.</w:t>
+        <w:t>Manual elaborado a partir de la interfaz v313, el motor SICOF_2026_10_03_V2, el informe continuo y la aplicación automática de aportaciones al vencimiento. Fecha de referencia: 3 de octubre de 2026. Los ejemplos son didácticos y no constituyen tasas aprobadas ni movimientos reales.</w:t>
       </w:r>
     </w:p>
     <w:p>
@@ -7199,7 +7209,7 @@
       <w:pStyle w:val="Footer"/>
     </w:pPr>
     <w:r>
-      <w:t xml:space="preserve">SICOF v312 · Edición 1.0 · 03/10/2026  |  Página </w:t>
+      <w:t xml:space="preserve">SICOF v313 · Edición 1.1 · 03/10/2026  |  Página </w:t>
     </w:r>
     <w:fldSimple w:instr="PAGE"/>
   </w:p>

</xml_diff>